<commit_message>
Add repo link + split Code & Data / Sources in report
</commit_message>
<xml_diff>
--- a/Mantle_SPCXx_interim_report.docx
+++ b/Mantle_SPCXx_interim_report.docx
@@ -892,7 +892,7 @@
           <w:color w:val="166A4D"/>
           <w:sz w:val="21"/>
         </w:rPr>
-        <w:t>REPRODUCIBILITY</w:t>
+        <w:t>CODE &amp; DATA AVAILABILITY</w:t>
       </w:r>
     </w:p>
     <w:p>
@@ -903,7 +903,29 @@
           <w:color w:val="666666"/>
           <w:sz w:val="20"/>
         </w:rPr>
-        <w:t>All swaps, fees, blocks and capacity metrics are reconstructed from Mantle public RPC (chainId 5000) and Nasdaq data; scripts and raw CSVs accompany this report. Re-running the pipeline on the latest blocks reproduces every figure and statistic. Cited context: SpaceX IPO and tokenized-stock allocation coverage (CoinDesk, CNBC, The Block, Chainwire); Mantle fee mechanism (Mantle Docs); RWA TVL +27% to $247.5M (Mantle Q1 2026 ecosystem report). Full links in the companion repository.</w:t>
+        <w:t>All code, raw datasets, and figures are open and fully reproducible: https://github.com/YohanesVito/mantle-spcxx-gasfee-research . Everything is reconstructed from Mantle public RPC (chainId 5000) and Nasdaq daily closes, with no API keys required. Running scripts/poll.sh then scripts/build_report.sh regenerates the complete analysis and every figure; the pipeline is deterministic from block numbers, so a fresh run on the same window reproduces identical results.</w:t>
+      </w:r>
+    </w:p>
+    <w:p>
+      <w:r>
+        <w:rPr>
+          <w:b/>
+          <w:i w:val="0"/>
+          <w:color w:val="166A4D"/>
+          <w:sz w:val="21"/>
+        </w:rPr>
+        <w:t>SOURCES</w:t>
+      </w:r>
+    </w:p>
+    <w:p>
+      <w:r>
+        <w:rPr>
+          <w:b w:val="0"/>
+          <w:i w:val="0"/>
+          <w:color w:val="666666"/>
+          <w:sz w:val="20"/>
+        </w:rPr>
+        <w:t>Background facts verified against CoinDesk, CNBC, The Block, and Chainwire; the Mantle fee mechanism from Mantle Docs; RWA TVL (+27% to $247.5M) from Mantle's Q1 2026 ecosystem report. Full links in the repository README.</w:t>
       </w:r>
     </w:p>
     <w:p>

</xml_diff>